<commit_message>
added Name month and days to the template and fixed some ui for the dtr
</commit_message>
<xml_diff>
--- a/resources/templates/dtr_template.docx
+++ b/resources/templates/dtr_template.docx
@@ -85,6 +85,13 @@
                 <w:bCs/>
               </w:rPr>
             </w:pPr>
+            <w:r>
+              <w:rPr>
+                <w:b/>
+                <w:bCs/>
+              </w:rPr>
+              <w:t>${EMP_NAME}</w:t>
+            </w:r>
           </w:p>
         </w:tc>
       </w:tr>
@@ -127,8 +134,8 @@
         <w:gridCol w:w="1719"/>
         <w:gridCol w:w="389"/>
         <w:gridCol w:w="1420"/>
-        <w:gridCol w:w="593"/>
-        <w:gridCol w:w="977"/>
+        <w:gridCol w:w="866"/>
+        <w:gridCol w:w="1273"/>
       </w:tblGrid>
       <w:tr>
         <w:trPr>
@@ -172,6 +179,14 @@
                 <w:sz w:val="16"/>
               </w:rPr>
             </w:pPr>
+            <w:r>
+              <w:rPr>
+                <w:i/>
+                <w:iCs/>
+                <w:sz w:val="16"/>
+              </w:rPr>
+              <w:t>${MONTH}</w:t>
+            </w:r>
           </w:p>
         </w:tc>
         <w:tc>
@@ -293,6 +308,13 @@
                 <w:bCs/>
               </w:rPr>
             </w:pPr>
+            <w:r>
+              <w:rPr>
+                <w:b/>
+                <w:bCs/>
+              </w:rPr>
+              <w:t>${REGULAR_DAYS}</w:t>
+            </w:r>
           </w:p>
         </w:tc>
       </w:tr>
@@ -786,15 +808,7 @@
                 <w:rFonts w:cs="Arial"/>
                 <w:sz w:val="18"/>
               </w:rPr>
-              <w:t>${</w:t>
-            </w:r>
-            <w:proofErr w:type="spellStart"/>
-            <w:r>
-              <w:rPr>
-                <w:rFonts w:cs="Arial"/>
-                <w:sz w:val="18"/>
-              </w:rPr>
-              <w:t>am_arriva</w:t>
+              <w:t>${am_arriva</w:t>
             </w:r>
             <w:r>
               <w:rPr>
@@ -803,7 +817,6 @@
               </w:rPr>
               <w:t>l</w:t>
             </w:r>
-            <w:proofErr w:type="spellEnd"/>
             <w:r>
               <w:rPr>
                 <w:rFonts w:cs="Arial"/>
@@ -834,23 +847,7 @@
                 <w:rFonts w:cs="Arial"/>
                 <w:sz w:val="18"/>
               </w:rPr>
-              <w:t>${</w:t>
-            </w:r>
-            <w:proofErr w:type="spellStart"/>
-            <w:r>
-              <w:rPr>
-                <w:rFonts w:cs="Arial"/>
-                <w:sz w:val="18"/>
-              </w:rPr>
-              <w:t>am_departure</w:t>
-            </w:r>
-            <w:proofErr w:type="spellEnd"/>
-            <w:r>
-              <w:rPr>
-                <w:rFonts w:cs="Arial"/>
-                <w:sz w:val="18"/>
-              </w:rPr>
-              <w:t>}</w:t>
+              <w:t>${am_departure}</w:t>
             </w:r>
           </w:p>
         </w:tc>
@@ -875,23 +872,7 @@
                 <w:rFonts w:cs="Arial"/>
                 <w:sz w:val="18"/>
               </w:rPr>
-              <w:t>${</w:t>
-            </w:r>
-            <w:proofErr w:type="spellStart"/>
-            <w:r>
-              <w:rPr>
-                <w:rFonts w:cs="Arial"/>
-                <w:sz w:val="18"/>
-              </w:rPr>
-              <w:t>pm_arrival</w:t>
-            </w:r>
-            <w:proofErr w:type="spellEnd"/>
-            <w:r>
-              <w:rPr>
-                <w:rFonts w:cs="Arial"/>
-                <w:sz w:val="18"/>
-              </w:rPr>
-              <w:t>}</w:t>
+              <w:t>${pm_arrival}</w:t>
             </w:r>
           </w:p>
         </w:tc>
@@ -916,23 +897,7 @@
                 <w:rFonts w:cs="Arial"/>
                 <w:sz w:val="18"/>
               </w:rPr>
-              <w:t>${</w:t>
-            </w:r>
-            <w:proofErr w:type="spellStart"/>
-            <w:r>
-              <w:rPr>
-                <w:rFonts w:cs="Arial"/>
-                <w:sz w:val="18"/>
-              </w:rPr>
-              <w:t>pm_departure</w:t>
-            </w:r>
-            <w:proofErr w:type="spellEnd"/>
-            <w:r>
-              <w:rPr>
-                <w:rFonts w:cs="Arial"/>
-                <w:sz w:val="18"/>
-              </w:rPr>
-              <w:t>}</w:t>
+              <w:t>${pm_departure}</w:t>
             </w:r>
           </w:p>
         </w:tc>
@@ -959,23 +924,7 @@
                 <w:rFonts w:cs="Arial"/>
                 <w:sz w:val="18"/>
               </w:rPr>
-              <w:t>${</w:t>
-            </w:r>
-            <w:proofErr w:type="spellStart"/>
-            <w:r>
-              <w:rPr>
-                <w:rFonts w:cs="Arial"/>
-                <w:sz w:val="18"/>
-              </w:rPr>
-              <w:t>undertime_hours</w:t>
-            </w:r>
-            <w:proofErr w:type="spellEnd"/>
-            <w:r>
-              <w:rPr>
-                <w:rFonts w:cs="Arial"/>
-                <w:sz w:val="18"/>
-              </w:rPr>
-              <w:t>}</w:t>
+              <w:t>${undertime_hours}</w:t>
             </w:r>
           </w:p>
         </w:tc>
@@ -1002,23 +951,7 @@
                 <w:rFonts w:cs="Arial"/>
                 <w:sz w:val="18"/>
               </w:rPr>
-              <w:t>${</w:t>
-            </w:r>
-            <w:proofErr w:type="spellStart"/>
-            <w:r>
-              <w:rPr>
-                <w:rFonts w:cs="Arial"/>
-                <w:sz w:val="18"/>
-              </w:rPr>
-              <w:t>undertime_minutes</w:t>
-            </w:r>
-            <w:proofErr w:type="spellEnd"/>
-            <w:r>
-              <w:rPr>
-                <w:rFonts w:cs="Arial"/>
-                <w:sz w:val="18"/>
-              </w:rPr>
-              <w:t>}</w:t>
+              <w:t>${undertime_minutes}</w:t>
             </w:r>
           </w:p>
         </w:tc>

</xml_diff>

<commit_message>
update for deploy ments, dtr template hr head change, leave application authorization xhange, leave application added  temp user for deployment
</commit_message>
<xml_diff>
--- a/resources/templates/dtr_template.docx
+++ b/resources/templates/dtr_template.docx
@@ -1181,10 +1181,21 @@
           </w:tcPr>
           <w:p>
             <w:pPr>
-              <w:rPr>
-                <w:sz w:val="14"/>
-              </w:rPr>
-            </w:pPr>
+              <w:jc w:val="center"/>
+              <w:rPr>
+                <w:b/>
+                <w:bCs/>
+                <w:szCs w:val="20"/>
+              </w:rPr>
+            </w:pPr>
+            <w:r>
+              <w:rPr>
+                <w:b/>
+                <w:bCs/>
+                <w:szCs w:val="20"/>
+              </w:rPr>
+              <w:t>MARK J. DOMINGUEZ</w:t>
+            </w:r>
           </w:p>
         </w:tc>
       </w:tr>

</xml_diff>